<commit_message>
Change AIMLE to AIE
</commit_message>
<xml_diff>
--- a/public/pdf/resume.docx
+++ b/public/pdf/resume.docx
@@ -175,7 +175,6 @@
           <w:szCs w:val="22"/>
         </w:rPr>
       </w:pPr>
-      <w:proofErr w:type="spellStart"/>
       <w:r>
         <w:rPr>
           <w:rStyle w:val="emailundefined"/>
@@ -184,18 +183,7 @@
           <w:sz w:val="22"/>
           <w:szCs w:val="22"/>
         </w:rPr>
-        <w:t>Github</w:t>
-      </w:r>
-      <w:proofErr w:type="spellEnd"/>
-      <w:r>
-        <w:rPr>
-          <w:rStyle w:val="emailundefined"/>
-          <w:rFonts w:ascii="Arial" w:eastAsia="Arial" w:hAnsi="Arial" w:cs="Arial"/>
-          <w:color w:val="000000"/>
-          <w:sz w:val="22"/>
-          <w:szCs w:val="22"/>
-        </w:rPr>
-        <w:t xml:space="preserve">: </w:t>
+        <w:t xml:space="preserve">Github: </w:t>
       </w:r>
       <w:hyperlink r:id="rId7" w:history="1">
         <w:r>
@@ -606,18 +594,8 @@
           <w:sz w:val="22"/>
           <w:szCs w:val="22"/>
         </w:rPr>
-        <w:t xml:space="preserve">, </w:t>
-      </w:r>
-      <w:proofErr w:type="spellStart"/>
-      <w:r>
-        <w:rPr>
-          <w:rFonts w:ascii="Arial" w:eastAsia="Arial" w:hAnsi="Arial" w:cs="Arial"/>
-          <w:sz w:val="22"/>
-          <w:szCs w:val="22"/>
-        </w:rPr>
-        <w:t>VSCode</w:t>
-      </w:r>
-      <w:proofErr w:type="spellEnd"/>
+        <w:t>, VSCode</w:t>
+      </w:r>
       <w:r>
         <w:rPr>
           <w:rFonts w:ascii="Arial" w:eastAsia="Arial" w:hAnsi="Arial" w:cs="Arial"/>
@@ -752,7 +730,7 @@
           <w:sz w:val="22"/>
           <w:szCs w:val="22"/>
         </w:rPr>
-        <w:t>AI/ML Engineering</w:t>
+        <w:t>AI Engineer</w:t>
       </w:r>
       <w:r>
         <w:rPr>
@@ -776,7 +754,6 @@
         </w:rPr>
         <w:t xml:space="preserve">, </w:t>
       </w:r>
-      <w:proofErr w:type="spellStart"/>
       <w:r>
         <w:rPr>
           <w:rStyle w:val="fs14fw6"/>
@@ -788,7 +765,6 @@
         </w:rPr>
         <w:t>Synapxe</w:t>
       </w:r>
-      <w:proofErr w:type="spellEnd"/>
       <w:r>
         <w:rPr>
           <w:rStyle w:val="fs14fw6undefinedtdn"/>
@@ -854,6 +830,17 @@
           <w:szCs w:val="12"/>
         </w:rPr>
         <w:t xml:space="preserve"> </w:t>
+      </w:r>
+      <w:r>
+        <w:rPr>
+          <w:rStyle w:val="fs14fw6"/>
+          <w:rFonts w:ascii="Arial" w:eastAsia="Arial" w:hAnsi="Arial" w:cs="Arial"/>
+          <w:b/>
+          <w:bCs/>
+          <w:sz w:val="12"/>
+          <w:szCs w:val="12"/>
+        </w:rPr>
+        <w:t xml:space="preserve">                      </w:t>
       </w:r>
       <w:r>
         <w:rPr>
@@ -889,47 +876,7 @@
           <w:sz w:val="22"/>
           <w:szCs w:val="22"/>
         </w:rPr>
-        <w:t xml:space="preserve">Built a Python based UDAD tool that classifies </w:t>
-      </w:r>
-      <w:proofErr w:type="spellStart"/>
-      <w:r>
-        <w:rPr>
-          <w:rStyle w:val="fs14fw6"/>
-          <w:rFonts w:ascii="Arial" w:eastAsia="Arial" w:hAnsi="Arial" w:cs="Arial"/>
-          <w:sz w:val="22"/>
-          <w:szCs w:val="22"/>
-        </w:rPr>
-        <w:t>authorised</w:t>
-      </w:r>
-      <w:proofErr w:type="spellEnd"/>
-      <w:r>
-        <w:rPr>
-          <w:rStyle w:val="fs14fw6"/>
-          <w:rFonts w:ascii="Arial" w:eastAsia="Arial" w:hAnsi="Arial" w:cs="Arial"/>
-          <w:sz w:val="22"/>
-          <w:szCs w:val="22"/>
-        </w:rPr>
-        <w:t xml:space="preserve"> and </w:t>
-      </w:r>
-      <w:proofErr w:type="spellStart"/>
-      <w:r>
-        <w:rPr>
-          <w:rStyle w:val="fs14fw6"/>
-          <w:rFonts w:ascii="Arial" w:eastAsia="Arial" w:hAnsi="Arial" w:cs="Arial"/>
-          <w:sz w:val="22"/>
-          <w:szCs w:val="22"/>
-        </w:rPr>
-        <w:t>unauthorised</w:t>
-      </w:r>
-      <w:proofErr w:type="spellEnd"/>
-      <w:r>
-        <w:rPr>
-          <w:rStyle w:val="fs14fw6"/>
-          <w:rFonts w:ascii="Arial" w:eastAsia="Arial" w:hAnsi="Arial" w:cs="Arial"/>
-          <w:sz w:val="22"/>
-          <w:szCs w:val="22"/>
-        </w:rPr>
-        <w:t xml:space="preserve"> access using either </w:t>
+        <w:t xml:space="preserve">Built a Python based UDAD tool that classifies authorised and unauthorised access using either </w:t>
       </w:r>
       <w:r>
         <w:rPr>
@@ -1008,27 +955,7 @@
           <w:sz w:val="22"/>
           <w:szCs w:val="22"/>
         </w:rPr>
-        <w:t xml:space="preserve">Deployed </w:t>
-      </w:r>
-      <w:proofErr w:type="spellStart"/>
-      <w:r>
-        <w:rPr>
-          <w:rStyle w:val="fs14fw6"/>
-          <w:rFonts w:ascii="Arial" w:eastAsia="Arial" w:hAnsi="Arial" w:cs="Arial"/>
-          <w:sz w:val="22"/>
-          <w:szCs w:val="22"/>
-        </w:rPr>
-        <w:t>LightRAG</w:t>
-      </w:r>
-      <w:proofErr w:type="spellEnd"/>
-      <w:r>
-        <w:rPr>
-          <w:rStyle w:val="fs14fw6"/>
-          <w:rFonts w:ascii="Arial" w:eastAsia="Arial" w:hAnsi="Arial" w:cs="Arial"/>
-          <w:sz w:val="22"/>
-          <w:szCs w:val="22"/>
-        </w:rPr>
-        <w:t xml:space="preserve"> on Azure App Service </w:t>
+        <w:t xml:space="preserve">Deployed LightRAG on Azure App Service </w:t>
       </w:r>
       <w:r>
         <w:rPr>
@@ -1039,25 +966,14 @@
         </w:rPr>
         <w:t xml:space="preserve">by resolving </w:t>
       </w:r>
-      <w:proofErr w:type="spellStart"/>
-      <w:r>
-        <w:rPr>
-          <w:rStyle w:val="fs14fw6"/>
-          <w:rFonts w:ascii="Arial" w:eastAsia="Arial" w:hAnsi="Arial" w:cs="Arial"/>
-          <w:sz w:val="22"/>
-          <w:szCs w:val="22"/>
-        </w:rPr>
-        <w:t>linux</w:t>
-      </w:r>
-      <w:proofErr w:type="spellEnd"/>
-      <w:r>
-        <w:rPr>
-          <w:rStyle w:val="fs14fw6"/>
-          <w:rFonts w:ascii="Arial" w:eastAsia="Arial" w:hAnsi="Arial" w:cs="Arial"/>
-          <w:sz w:val="22"/>
-          <w:szCs w:val="22"/>
-        </w:rPr>
-        <w:t xml:space="preserve"> wheel</w:t>
+      <w:r>
+        <w:rPr>
+          <w:rStyle w:val="fs14fw6"/>
+          <w:rFonts w:ascii="Arial" w:eastAsia="Arial" w:hAnsi="Arial" w:cs="Arial"/>
+          <w:sz w:val="22"/>
+          <w:szCs w:val="22"/>
+        </w:rPr>
+        <w:t>linux wheel</w:t>
       </w:r>
       <w:r>
         <w:rPr>
@@ -1156,25 +1072,14 @@
           <w:szCs w:val="22"/>
         </w:rPr>
       </w:pPr>
-      <w:proofErr w:type="spellStart"/>
-      <w:r>
-        <w:rPr>
-          <w:rStyle w:val="fs14fw6"/>
-          <w:rFonts w:ascii="Arial" w:eastAsia="Arial" w:hAnsi="Arial" w:cs="Arial"/>
-          <w:sz w:val="22"/>
-          <w:szCs w:val="22"/>
-        </w:rPr>
-        <w:t>Optimised</w:t>
-      </w:r>
-      <w:proofErr w:type="spellEnd"/>
-      <w:r>
-        <w:rPr>
-          <w:rStyle w:val="fs14fw6"/>
-          <w:rFonts w:ascii="Arial" w:eastAsia="Arial" w:hAnsi="Arial" w:cs="Arial"/>
-          <w:sz w:val="22"/>
-          <w:szCs w:val="22"/>
-        </w:rPr>
-        <w:t xml:space="preserve"> the AI2D feature building pipeline by integrating Polars, cutting loading time from around 282 seconds to 22 seconds on a desktop and from around 443 seconds to 78 seconds on a laptop, </w:t>
+      <w:r>
+        <w:rPr>
+          <w:rStyle w:val="fs14fw6"/>
+          <w:rFonts w:ascii="Arial" w:eastAsia="Arial" w:hAnsi="Arial" w:cs="Arial"/>
+          <w:sz w:val="22"/>
+          <w:szCs w:val="22"/>
+        </w:rPr>
+        <w:t xml:space="preserve">Optimised the AI2D feature building pipeline by integrating Polars, cutting loading time from around 282 seconds to 22 seconds on a desktop and from around 443 seconds to 78 seconds on a laptop, </w:t>
       </w:r>
       <w:r>
         <w:rPr>
@@ -1253,27 +1158,7 @@
           <w:sz w:val="22"/>
           <w:szCs w:val="22"/>
         </w:rPr>
-        <w:t xml:space="preserve">Explored DLP use cases by evaluating local LLMs such as </w:t>
-      </w:r>
-      <w:proofErr w:type="spellStart"/>
-      <w:r>
-        <w:rPr>
-          <w:rStyle w:val="fs14fw6"/>
-          <w:rFonts w:ascii="Arial" w:eastAsia="Arial" w:hAnsi="Arial" w:cs="Arial"/>
-          <w:sz w:val="22"/>
-          <w:szCs w:val="22"/>
-        </w:rPr>
-        <w:t>Ollama</w:t>
-      </w:r>
-      <w:proofErr w:type="spellEnd"/>
-      <w:r>
-        <w:rPr>
-          <w:rStyle w:val="fs14fw6"/>
-          <w:rFonts w:ascii="Arial" w:eastAsia="Arial" w:hAnsi="Arial" w:cs="Arial"/>
-          <w:sz w:val="22"/>
-          <w:szCs w:val="22"/>
-        </w:rPr>
-        <w:t xml:space="preserve"> models for PII detection on strings </w:t>
+        <w:t xml:space="preserve">Explored DLP use cases by evaluating local LLMs such as Ollama models for PII detection on strings </w:t>
       </w:r>
       <w:r>
         <w:rPr>
@@ -2150,65 +2035,14 @@
           <w:szCs w:val="22"/>
         </w:rPr>
       </w:pPr>
-      <w:proofErr w:type="spellStart"/>
-      <w:r>
-        <w:rPr>
-          <w:rStyle w:val="fs14fw6"/>
-          <w:rFonts w:ascii="Arial" w:eastAsia="Arial" w:hAnsi="Arial" w:cs="Arial"/>
-          <w:sz w:val="22"/>
-          <w:szCs w:val="22"/>
-        </w:rPr>
-        <w:t>Utilised</w:t>
-      </w:r>
-      <w:proofErr w:type="spellEnd"/>
-      <w:r>
-        <w:rPr>
-          <w:rStyle w:val="fs14fw6"/>
-          <w:rFonts w:ascii="Arial" w:eastAsia="Arial" w:hAnsi="Arial" w:cs="Arial"/>
-          <w:sz w:val="22"/>
-          <w:szCs w:val="22"/>
-        </w:rPr>
-        <w:t xml:space="preserve"> three CNN models (</w:t>
-      </w:r>
-      <w:proofErr w:type="spellStart"/>
-      <w:r>
-        <w:rPr>
-          <w:rStyle w:val="fs14fw6"/>
-          <w:rFonts w:ascii="Arial" w:eastAsia="Arial" w:hAnsi="Arial" w:cs="Arial"/>
-          <w:sz w:val="22"/>
-          <w:szCs w:val="22"/>
-        </w:rPr>
-        <w:t>ConvNet</w:t>
-      </w:r>
-      <w:proofErr w:type="spellEnd"/>
-      <w:r>
-        <w:rPr>
-          <w:rStyle w:val="fs14fw6"/>
-          <w:rFonts w:ascii="Arial" w:eastAsia="Arial" w:hAnsi="Arial" w:cs="Arial"/>
-          <w:sz w:val="22"/>
-          <w:szCs w:val="22"/>
-        </w:rPr>
-        <w:t xml:space="preserve">, ResNet18, DenseNet121) from </w:t>
-      </w:r>
-      <w:proofErr w:type="spellStart"/>
-      <w:r>
-        <w:rPr>
-          <w:rStyle w:val="fs14fw6"/>
-          <w:rFonts w:ascii="Arial" w:eastAsia="Arial" w:hAnsi="Arial" w:cs="Arial"/>
-          <w:sz w:val="22"/>
-          <w:szCs w:val="22"/>
-        </w:rPr>
-        <w:t>PyTorch</w:t>
-      </w:r>
-      <w:proofErr w:type="spellEnd"/>
-      <w:r>
-        <w:rPr>
-          <w:rStyle w:val="fs14fw6"/>
-          <w:rFonts w:ascii="Arial" w:eastAsia="Arial" w:hAnsi="Arial" w:cs="Arial"/>
-          <w:sz w:val="22"/>
-          <w:szCs w:val="22"/>
-        </w:rPr>
-        <w:t xml:space="preserve"> library </w:t>
+      <w:r>
+        <w:rPr>
+          <w:rStyle w:val="fs14fw6"/>
+          <w:rFonts w:ascii="Arial" w:eastAsia="Arial" w:hAnsi="Arial" w:cs="Arial"/>
+          <w:sz w:val="22"/>
+          <w:szCs w:val="22"/>
+        </w:rPr>
+        <w:t xml:space="preserve">Utilised three CNN models (ConvNet, ResNet18, DenseNet121) from PyTorch library </w:t>
       </w:r>
     </w:p>
     <w:p>
@@ -2233,47 +2067,7 @@
           <w:sz w:val="22"/>
           <w:szCs w:val="22"/>
         </w:rPr>
-        <w:t xml:space="preserve">Applied </w:t>
-      </w:r>
-      <w:proofErr w:type="spellStart"/>
-      <w:r>
-        <w:rPr>
-          <w:rStyle w:val="fs14fw6"/>
-          <w:rFonts w:ascii="Arial" w:eastAsia="Arial" w:hAnsi="Arial" w:cs="Arial"/>
-          <w:sz w:val="22"/>
-          <w:szCs w:val="22"/>
-        </w:rPr>
-        <w:t>GradCAM</w:t>
-      </w:r>
-      <w:proofErr w:type="spellEnd"/>
-      <w:r>
-        <w:rPr>
-          <w:rStyle w:val="fs14fw6"/>
-          <w:rFonts w:ascii="Arial" w:eastAsia="Arial" w:hAnsi="Arial" w:cs="Arial"/>
-          <w:sz w:val="22"/>
-          <w:szCs w:val="22"/>
-        </w:rPr>
-        <w:t xml:space="preserve"> and </w:t>
-      </w:r>
-      <w:proofErr w:type="spellStart"/>
-      <w:r>
-        <w:rPr>
-          <w:rStyle w:val="fs14fw6"/>
-          <w:rFonts w:ascii="Arial" w:eastAsia="Arial" w:hAnsi="Arial" w:cs="Arial"/>
-          <w:sz w:val="22"/>
-          <w:szCs w:val="22"/>
-        </w:rPr>
-        <w:t>GradCAM</w:t>
-      </w:r>
-      <w:proofErr w:type="spellEnd"/>
-      <w:r>
-        <w:rPr>
-          <w:rStyle w:val="fs14fw6"/>
-          <w:rFonts w:ascii="Arial" w:eastAsia="Arial" w:hAnsi="Arial" w:cs="Arial"/>
-          <w:sz w:val="22"/>
-          <w:szCs w:val="22"/>
-        </w:rPr>
-        <w:t xml:space="preserve">++ to visualize decision-making regions </w:t>
+        <w:t xml:space="preserve">Applied GradCAM and GradCAM++ to visualize decision-making regions </w:t>
       </w:r>
     </w:p>
     <w:p>
@@ -2502,75 +2296,29 @@
           <w:szCs w:val="22"/>
         </w:rPr>
       </w:pPr>
-      <w:proofErr w:type="spellStart"/>
-      <w:r>
-        <w:rPr>
-          <w:rFonts w:ascii="Arial" w:eastAsia="Arial" w:hAnsi="Arial" w:cs="Arial"/>
-          <w:sz w:val="22"/>
-          <w:szCs w:val="22"/>
-        </w:rPr>
-        <w:t>Utilised</w:t>
-      </w:r>
-      <w:proofErr w:type="spellEnd"/>
-      <w:r>
-        <w:rPr>
-          <w:rFonts w:ascii="Arial" w:eastAsia="Arial" w:hAnsi="Arial" w:cs="Arial"/>
-          <w:sz w:val="22"/>
-          <w:szCs w:val="22"/>
-        </w:rPr>
-        <w:t xml:space="preserve"> four Machine Learning models </w:t>
-      </w:r>
-      <w:r>
-        <w:rPr>
-          <w:rFonts w:ascii="Arial" w:eastAsia="Arial" w:hAnsi="Arial" w:cs="Arial"/>
-          <w:sz w:val="22"/>
-          <w:szCs w:val="22"/>
-        </w:rPr>
-        <w:t xml:space="preserve">(LR, </w:t>
-      </w:r>
-      <w:proofErr w:type="spellStart"/>
-      <w:r>
-        <w:rPr>
-          <w:rFonts w:ascii="Arial" w:eastAsia="Arial" w:hAnsi="Arial" w:cs="Arial"/>
-          <w:sz w:val="22"/>
-          <w:szCs w:val="22"/>
-        </w:rPr>
-        <w:t>kNN</w:t>
-      </w:r>
-      <w:proofErr w:type="spellEnd"/>
-      <w:r>
-        <w:rPr>
-          <w:rFonts w:ascii="Arial" w:eastAsia="Arial" w:hAnsi="Arial" w:cs="Arial"/>
-          <w:sz w:val="22"/>
-          <w:szCs w:val="22"/>
-        </w:rPr>
-        <w:t xml:space="preserve">, RF, SVM) </w:t>
-      </w:r>
-      <w:r>
-        <w:rPr>
-          <w:rFonts w:ascii="Arial" w:eastAsia="Arial" w:hAnsi="Arial" w:cs="Arial"/>
-          <w:sz w:val="22"/>
-          <w:szCs w:val="22"/>
-        </w:rPr>
-        <w:t xml:space="preserve">from </w:t>
-      </w:r>
-      <w:proofErr w:type="spellStart"/>
-      <w:r>
-        <w:rPr>
-          <w:rFonts w:ascii="Arial" w:eastAsia="Arial" w:hAnsi="Arial" w:cs="Arial"/>
-          <w:sz w:val="22"/>
-          <w:szCs w:val="22"/>
-        </w:rPr>
-        <w:t>sklearn</w:t>
-      </w:r>
-      <w:proofErr w:type="spellEnd"/>
-      <w:r>
-        <w:rPr>
-          <w:rFonts w:ascii="Arial" w:eastAsia="Arial" w:hAnsi="Arial" w:cs="Arial"/>
-          <w:sz w:val="22"/>
-          <w:szCs w:val="22"/>
-        </w:rPr>
-        <w:t xml:space="preserve"> library</w:t>
+      <w:r>
+        <w:rPr>
+          <w:rFonts w:ascii="Arial" w:eastAsia="Arial" w:hAnsi="Arial" w:cs="Arial"/>
+          <w:sz w:val="22"/>
+          <w:szCs w:val="22"/>
+        </w:rPr>
+        <w:t xml:space="preserve">Utilised four Machine Learning models </w:t>
+      </w:r>
+      <w:r>
+        <w:rPr>
+          <w:rFonts w:ascii="Arial" w:eastAsia="Arial" w:hAnsi="Arial" w:cs="Arial"/>
+          <w:sz w:val="22"/>
+          <w:szCs w:val="22"/>
+        </w:rPr>
+        <w:t xml:space="preserve">(LR, kNN, RF, SVM) </w:t>
+      </w:r>
+      <w:r>
+        <w:rPr>
+          <w:rFonts w:ascii="Arial" w:eastAsia="Arial" w:hAnsi="Arial" w:cs="Arial"/>
+          <w:sz w:val="22"/>
+          <w:szCs w:val="22"/>
+        </w:rPr>
+        <w:t>from sklearn library</w:t>
       </w:r>
     </w:p>
     <w:p>
@@ -2601,25 +2349,7 @@
           <w:sz w:val="22"/>
           <w:szCs w:val="22"/>
         </w:rPr>
-        <w:t xml:space="preserve"> benign and malignant </w:t>
-      </w:r>
-      <w:proofErr w:type="spellStart"/>
-      <w:r>
-        <w:rPr>
-          <w:rFonts w:ascii="Arial" w:eastAsia="Arial" w:hAnsi="Arial" w:cs="Arial"/>
-          <w:sz w:val="22"/>
-          <w:szCs w:val="22"/>
-        </w:rPr>
-        <w:t>tumours</w:t>
-      </w:r>
-      <w:proofErr w:type="spellEnd"/>
-      <w:r>
-        <w:rPr>
-          <w:rFonts w:ascii="Arial" w:eastAsia="Arial" w:hAnsi="Arial" w:cs="Arial"/>
-          <w:sz w:val="22"/>
-          <w:szCs w:val="22"/>
-        </w:rPr>
-        <w:t xml:space="preserve"> with </w:t>
+        <w:t xml:space="preserve"> benign and malignant tumours with </w:t>
       </w:r>
       <w:r>
         <w:rPr>
@@ -2666,7 +2396,6 @@
         </w:rPr>
         <w:t xml:space="preserve">Orbital: </w:t>
       </w:r>
-      <w:proofErr w:type="spellStart"/>
       <w:r>
         <w:rPr>
           <w:rStyle w:val="fs14fw6"/>
@@ -2700,7 +2429,6 @@
         </w:rPr>
         <w:t>queSt</w:t>
       </w:r>
-      <w:proofErr w:type="spellEnd"/>
       <w:r>
         <w:rPr>
           <w:rStyle w:val="fs14fw6"/>
@@ -3024,43 +2752,7 @@
           <w:sz w:val="22"/>
           <w:szCs w:val="22"/>
         </w:rPr>
-        <w:t xml:space="preserve">where each enemy type has unique implementations of </w:t>
-      </w:r>
-      <w:proofErr w:type="spellStart"/>
-      <w:r>
-        <w:rPr>
-          <w:rFonts w:ascii="Arial" w:eastAsia="Arial" w:hAnsi="Arial" w:cs="Arial"/>
-          <w:sz w:val="22"/>
-          <w:szCs w:val="22"/>
-        </w:rPr>
-        <w:t>movesets</w:t>
-      </w:r>
-      <w:proofErr w:type="spellEnd"/>
-      <w:r>
-        <w:rPr>
-          <w:rFonts w:ascii="Arial" w:eastAsia="Arial" w:hAnsi="Arial" w:cs="Arial"/>
-          <w:sz w:val="22"/>
-          <w:szCs w:val="22"/>
-        </w:rPr>
-        <w:t xml:space="preserve">, </w:t>
-      </w:r>
-      <w:proofErr w:type="spellStart"/>
-      <w:r>
-        <w:rPr>
-          <w:rFonts w:ascii="Arial" w:eastAsia="Arial" w:hAnsi="Arial" w:cs="Arial"/>
-          <w:sz w:val="22"/>
-          <w:szCs w:val="22"/>
-        </w:rPr>
-        <w:t>behaviours</w:t>
-      </w:r>
-      <w:proofErr w:type="spellEnd"/>
-      <w:r>
-        <w:rPr>
-          <w:rFonts w:ascii="Arial" w:eastAsia="Arial" w:hAnsi="Arial" w:cs="Arial"/>
-          <w:sz w:val="22"/>
-          <w:szCs w:val="22"/>
-        </w:rPr>
-        <w:t xml:space="preserve"> and patterns</w:t>
+        <w:t>where each enemy type has unique implementations of movesets, behaviours and patterns</w:t>
       </w:r>
     </w:p>
     <w:p>
@@ -3387,27 +3079,7 @@
           <w:sz w:val="22"/>
           <w:szCs w:val="22"/>
         </w:rPr>
-        <w:t xml:space="preserve">Volunteered with five others in assisting administrative matters for </w:t>
-      </w:r>
-      <w:proofErr w:type="spellStart"/>
-      <w:r>
-        <w:rPr>
-          <w:rStyle w:val="fs14fw6"/>
-          <w:rFonts w:ascii="Arial" w:eastAsia="Arial" w:hAnsi="Arial" w:cs="Arial"/>
-          <w:sz w:val="22"/>
-          <w:szCs w:val="22"/>
-        </w:rPr>
-        <w:t>Daedo</w:t>
-      </w:r>
-      <w:proofErr w:type="spellEnd"/>
-      <w:r>
-        <w:rPr>
-          <w:rStyle w:val="fs14fw6"/>
-          <w:rFonts w:ascii="Arial" w:eastAsia="Arial" w:hAnsi="Arial" w:cs="Arial"/>
-          <w:sz w:val="22"/>
-          <w:szCs w:val="22"/>
-        </w:rPr>
-        <w:t xml:space="preserve"> Poomsae</w:t>
+        <w:t>Volunteered with five others in assisting administrative matters for Daedo Poomsae</w:t>
       </w:r>
       <w:r>
         <w:rPr>
@@ -3666,27 +3338,7 @@
           <w:sz w:val="22"/>
           <w:szCs w:val="22"/>
         </w:rPr>
-        <w:t xml:space="preserve">Achieved a Bronze Medal during the JPJC Inter-House Games for </w:t>
-      </w:r>
-      <w:proofErr w:type="spellStart"/>
-      <w:r>
-        <w:rPr>
-          <w:rStyle w:val="fs14fw6"/>
-          <w:rFonts w:ascii="Arial" w:eastAsia="Arial" w:hAnsi="Arial" w:cs="Arial"/>
-          <w:sz w:val="22"/>
-          <w:szCs w:val="22"/>
-        </w:rPr>
-        <w:t>Brawlhalla</w:t>
-      </w:r>
-      <w:proofErr w:type="spellEnd"/>
-      <w:r>
-        <w:rPr>
-          <w:rStyle w:val="fs14fw6"/>
-          <w:rFonts w:ascii="Arial" w:eastAsia="Arial" w:hAnsi="Arial" w:cs="Arial"/>
-          <w:sz w:val="22"/>
-          <w:szCs w:val="22"/>
-        </w:rPr>
-        <w:t xml:space="preserve"> in 2018 </w:t>
+        <w:t xml:space="preserve">Achieved a Bronze Medal during the JPJC Inter-House Games for Brawlhalla in 2018 </w:t>
       </w:r>
     </w:p>
     <w:p>

</xml_diff>

<commit_message>
Update NUS end date
</commit_message>
<xml_diff>
--- a/public/pdf/resume.docx
+++ b/public/pdf/resume.docx
@@ -347,18 +347,51 @@
           <w:sz w:val="22"/>
           <w:szCs w:val="22"/>
         </w:rPr>
-        <w:t xml:space="preserve">         Aug 2022</w:t>
-      </w:r>
-      <w:r>
-        <w:rPr>
-          <w:rStyle w:val="fs14fw6"/>
-          <w:rFonts w:ascii="Arial" w:eastAsia="Arial" w:hAnsi="Arial" w:cs="Arial"/>
-          <w:b/>
-          <w:bCs/>
-          <w:sz w:val="22"/>
-          <w:szCs w:val="22"/>
-        </w:rPr>
-        <w:t xml:space="preserve"> – Present</w:t>
+        <w:t xml:space="preserve">     </w:t>
+      </w:r>
+      <w:r>
+        <w:rPr>
+          <w:rStyle w:val="fs14fw6"/>
+          <w:rFonts w:ascii="Arial" w:eastAsia="Arial" w:hAnsi="Arial" w:cs="Arial"/>
+          <w:b/>
+          <w:bCs/>
+          <w:sz w:val="22"/>
+          <w:szCs w:val="22"/>
+        </w:rPr>
+        <w:t xml:space="preserve"> </w:t>
+      </w:r>
+      <w:r>
+        <w:rPr>
+          <w:rStyle w:val="fs14fw6"/>
+          <w:rFonts w:ascii="Arial" w:eastAsia="Arial" w:hAnsi="Arial" w:cs="Arial"/>
+          <w:b/>
+          <w:bCs/>
+          <w:sz w:val="22"/>
+          <w:szCs w:val="22"/>
+        </w:rPr>
+        <w:t>Aug 2022</w:t>
+      </w:r>
+      <w:r>
+        <w:rPr>
+          <w:rStyle w:val="fs14fw6"/>
+          <w:rFonts w:ascii="Arial" w:eastAsia="Arial" w:hAnsi="Arial" w:cs="Arial"/>
+          <w:b/>
+          <w:bCs/>
+          <w:sz w:val="22"/>
+          <w:szCs w:val="22"/>
+        </w:rPr>
+        <w:t xml:space="preserve"> – </w:t>
+      </w:r>
+      <w:r>
+        <w:rPr>
+          <w:rStyle w:val="fs14fw6"/>
+          <w:rFonts w:ascii="Arial" w:eastAsia="Arial" w:hAnsi="Arial" w:cs="Arial"/>
+          <w:b/>
+          <w:bCs/>
+          <w:sz w:val="22"/>
+          <w:szCs w:val="22"/>
+        </w:rPr>
+        <w:t>Jun 2026</w:t>
       </w:r>
     </w:p>
     <w:p>
@@ -3510,17 +3543,27 @@
           <w:sz w:val="22"/>
           <w:szCs w:val="22"/>
         </w:rPr>
-        <w:t xml:space="preserve">    </w:t>
-      </w:r>
-      <w:r>
-        <w:rPr>
-          <w:rFonts w:ascii="Arial" w:eastAsia="Arial" w:hAnsi="Arial" w:cs="Arial"/>
-          <w:b/>
-          <w:bCs/>
-          <w:sz w:val="22"/>
-          <w:szCs w:val="22"/>
-        </w:rPr>
-        <w:t xml:space="preserve">Jan 2014 - Nov 2017 </w:t>
+        <w:t xml:space="preserve">   </w:t>
+      </w:r>
+      <w:r>
+        <w:rPr>
+          <w:rFonts w:ascii="Arial" w:eastAsia="Arial" w:hAnsi="Arial" w:cs="Arial"/>
+          <w:b/>
+          <w:bCs/>
+          <w:sz w:val="22"/>
+          <w:szCs w:val="22"/>
+        </w:rPr>
+        <w:t xml:space="preserve">Jan 2014 </w:t>
+      </w:r>
+      <w:r>
+        <w:rPr>
+          <w:rFonts w:ascii="Arial" w:eastAsia="Arial" w:hAnsi="Arial" w:cs="Arial"/>
+          <w:b/>
+          <w:bCs/>
+          <w:sz w:val="22"/>
+          <w:szCs w:val="22"/>
+        </w:rPr>
+        <w:t>– Nov 2017</w:t>
       </w:r>
     </w:p>
     <w:p>

</xml_diff>